<commit_message>
Expand ML workflow diagram package
</commit_message>
<xml_diff>
--- a/docs/project_blueprints/North_Slope_Gas_Hydrate_Full_ML_Workflow_Diagram_2026-06-15.docx
+++ b/docs/project_blueprints/North_Slope_Gas_Hydrate_Full_ML_Workflow_Diagram_2026-06-15.docx
@@ -12,7 +12,7 @@
     </w:p>
     <w:p>
       <w:r>
-        <w:t>This companion page explains the one-map workflow requested for the slide refresh. The figure connects public source inputs, OpenScienceLab and approved-runtime inputs, the guarded pressure-temperature stability branch, feature engineering, the leakage barrier, occurrence classification, saturation regression, validation, and public-safe exports.</w:t>
+        <w:t>This companion page explains the one-map workflow requested for the slide refresh. The figure connects source and schema controls, OpenScienceLab and approved-runtime inputs, the guarded pressure-temperature stability branch, well-log physics equations, the leakage barrier, occurrence classification, saturation regression, validation, and reviewed exports.</w:t>
       </w:r>
     </w:p>
     <w:p>
@@ -64,7 +64,7 @@
         <w:pStyle w:val="ListBullet"/>
       </w:pPr>
       <w:r>
-        <w:t>The left lane is the public delivery surface: public sources, public stability products, GitHub, Streamlit, Word, and slides.</w:t>
+        <w:t>The left lane is source and schema control: public-source context, current status counts, original headers, unit checks, depth basis, and QC gates.</w:t>
       </w:r>
     </w:p>
     <w:p>
@@ -72,7 +72,15 @@
         <w:pStyle w:val="ListBullet"/>
       </w:pPr>
       <w:r>
-        <w:t>The center and right lanes are the OSL and approved-runtime path: raw source rebuilds, approved logs/core/NMR later, preprocessing, feature engineering, modeling, and validation.</w:t>
+        <w:t>The center and right lanes are the OSL and approved-runtime path: raw source rebuilds, approved logs/core/NMR later, pressure-temperature stability context, feature engineering, modeling, and validation.</w:t>
+      </w:r>
+    </w:p>
+    <w:p>
+      <w:pPr>
+        <w:pStyle w:val="ListBullet"/>
+      </w:pPr>
+      <w:r>
+        <w:t>The equation blocks show how pressure, temperature, phase-boundary lookup, lithology, porosity, velocity, elastic, and saturation-baseline calculations become context fields, features, or validation checks.</w:t>
       </w:r>
     </w:p>
     <w:p>

</xml_diff>

<commit_message>
Add ML architecture diagram and space workflow
</commit_message>
<xml_diff>
--- a/docs/project_blueprints/North_Slope_Gas_Hydrate_Full_ML_Workflow_Diagram_2026-06-15.docx
+++ b/docs/project_blueprints/North_Slope_Gas_Hydrate_Full_ML_Workflow_Diagram_2026-06-15.docx
@@ -41,6 +41,55 @@
                     <a:xfrm>
                       <a:off x="0" y="0"/>
                       <a:ext cx="9052560" cy="5092065"/>
+                    </a:xfrm>
+                    <a:prstGeom prst="rect"/>
+                  </pic:spPr>
+                </pic:pic>
+              </a:graphicData>
+            </a:graphic>
+          </wp:inline>
+        </w:drawing>
+      </w:r>
+    </w:p>
+    <w:p>
+      <w:pPr>
+        <w:pStyle w:val="Heading1"/>
+      </w:pPr>
+      <w:r>
+        <w:t>ML Architecture Detail</w:t>
+      </w:r>
+    </w:p>
+    <w:p>
+      <w:r>
+        <w:t>The companion architecture visual expands the modeling block into feature groups, QC and train-only preprocessing, a neural-network-style candidate path, two output heads, and the target-only rail used for training labels and validation overlays.</w:t>
+      </w:r>
+    </w:p>
+    <w:p>
+      <w:r>
+        <w:drawing>
+          <wp:inline xmlns:a="http://schemas.openxmlformats.org/drawingml/2006/main" xmlns:pic="http://schemas.openxmlformats.org/drawingml/2006/picture">
+            <wp:extent cx="9052560" cy="5222631"/>
+            <wp:docPr id="2" name="Picture 2"/>
+            <wp:cNvGraphicFramePr>
+              <a:graphicFrameLocks noChangeAspect="1"/>
+            </wp:cNvGraphicFramePr>
+            <a:graphic>
+              <a:graphicData uri="http://schemas.openxmlformats.org/drawingml/2006/picture">
+                <pic:pic>
+                  <pic:nvPicPr>
+                    <pic:cNvPr id="0" name="ml_pipeline_network_detail_v4.png"/>
+                    <pic:cNvPicPr/>
+                  </pic:nvPicPr>
+                  <pic:blipFill>
+                    <a:blip r:embed="rId10"/>
+                    <a:stretch>
+                      <a:fillRect/>
+                    </a:stretch>
+                  </pic:blipFill>
+                  <pic:spPr>
+                    <a:xfrm>
+                      <a:off x="0" y="0"/>
+                      <a:ext cx="9052560" cy="5222631"/>
                     </a:xfrm>
                     <a:prstGeom prst="rect"/>
                   </pic:spPr>

</xml_diff>

<commit_message>
Add V5 mentor status package
</commit_message>
<xml_diff>
--- a/docs/project_blueprints/North_Slope_Gas_Hydrate_Full_ML_Workflow_Diagram_2026-06-15.docx
+++ b/docs/project_blueprints/North_Slope_Gas_Hydrate_Full_ML_Workflow_Diagram_2026-06-15.docx
@@ -13,6 +13,160 @@
     <w:p>
       <w:r>
         <w:t>This companion page explains the one-map workflow requested for the slide refresh. The figure connects source and schema controls, OpenScienceLab and approved-runtime inputs, the guarded pressure-temperature stability branch, well-log physics equations, the leakage barrier, occurrence classification, saturation regression, validation, and reviewed exports.</w:t>
+      </w:r>
+    </w:p>
+    <w:p>
+      <w:pPr>
+        <w:pStyle w:val="Heading1"/>
+      </w:pPr>
+      <w:r>
+        <w:t>Project Status In Plain Language</w:t>
+      </w:r>
+    </w:p>
+    <w:p>
+      <w:r>
+        <w:t>The project is building a defensible North Slope workflow for gas hydrate occurrence classification and saturation regression. The public GitHub/Streamlit side explains source-backed methods, public scaffold counts, diagrams, and public-safe outputs. OpenScienceLab and the later approved runtime are where raw source bundles, approved well logs, core/NMR information, target labels, feature engineering, model fitting, validation, and reviewed outputs belong.</w:t>
+      </w:r>
+    </w:p>
+    <w:p>
+      <w:pPr>
+        <w:pStyle w:val="Heading1"/>
+      </w:pPr>
+      <w:r>
+        <w:t>What Is Complete Outside Stability</w:t>
+      </w:r>
+    </w:p>
+    <w:p>
+      <w:pPr>
+        <w:pStyle w:val="ListBullet"/>
+      </w:pPr>
+      <w:r>
+        <w:t>The public/runtime data boundary is documented and reflected in the V5 workflow diagrams.</w:t>
+      </w:r>
+    </w:p>
+    <w:p>
+      <w:pPr>
+        <w:pStyle w:val="ListBullet"/>
+      </w:pPr>
+      <w:r>
+        <w:t>The approved-data schema coverage matrix preserves original headers and separates measured inputs, derived features, QC/alignment fields, calibration/reference fields, target-only fields, and unresolved fields.</w:t>
+      </w:r>
+    </w:p>
+    <w:p>
+      <w:pPr>
+        <w:pStyle w:val="ListBullet"/>
+      </w:pPr>
+      <w:r>
+        <w:t>The target registry and leakage guardrails keep Sgh, S_h, Sh, NMR_SAT, hydrate-saturation fields, Swr, S_wr, and phase labels out of the predictor matrix.</w:t>
+      </w:r>
+    </w:p>
+    <w:p>
+      <w:pPr>
+        <w:pStyle w:val="ListBullet"/>
+      </w:pPr>
+      <w:r>
+        <w:t>The Analyze Hydrates page includes Schema Coverage &amp; Architecture, Public ML Readiness, and Target Registry &amp; Leakage views without exposing approved rows or model metrics.</w:t>
+      </w:r>
+    </w:p>
+    <w:p>
+      <w:pPr>
+        <w:pStyle w:val="ListBullet"/>
+      </w:pPr>
+      <w:r>
+        <w:t>The future ML architecture is defined as a leakage-safe path to linked occurrence classification and saturation regression, but final training and performance reporting remain blocked until approved labels and complete rows are available.</w:t>
+      </w:r>
+    </w:p>
+    <w:p>
+      <w:pPr>
+        <w:pStyle w:val="Heading1"/>
+      </w:pPr>
+      <w:r>
+        <w:t>What Stability Currently Does</w:t>
+      </w:r>
+    </w:p>
+    <w:p>
+      <w:r>
+        <w:t>The baseline public stability screen has 8,084 rows, 22 calculated pressure-temperature admissibility intervals, 8 sufficient-input no-stable-interval rows, and 8,054 blocked rows. It uses the cited methane 5 ppt phase lookup, hydrostatic absolute pressure, public G10015/GGD223 temperature and permafrost context, and source-control caveats.</w:t>
+      </w:r>
+    </w:p>
+    <w:p>
+      <w:pPr>
+        <w:pStyle w:val="ListBullet"/>
+      </w:pPr>
+      <w:r>
+        <w:t>It can serve the ML workflow as context, a mask, a confidence field, a caveat field, or a reason flag.</w:t>
+      </w:r>
+    </w:p>
+    <w:p>
+      <w:pPr>
+        <w:pStyle w:val="ListBullet"/>
+      </w:pPr>
+      <w:r>
+        <w:t>It does not prove hydrate occurrence, estimate saturation, define final top/base/thickness for approved interpretation, rank sweet spots, or replace log/core evidence.</w:t>
+      </w:r>
+    </w:p>
+    <w:p>
+      <w:pPr>
+        <w:pStyle w:val="ListBullet"/>
+      </w:pPr>
+      <w:r>
+        <w:t>Blocked rows mean the calculation refused to overclaim without required inputs; they do not mean no hydrate.</w:t>
+      </w:r>
+    </w:p>
+    <w:p>
+      <w:pPr>
+        <w:pStyle w:val="Heading1"/>
+      </w:pPr>
+      <w:r>
+        <w:t>How Approved OSL Data Feed The Future ML Pipeline</w:t>
+      </w:r>
+    </w:p>
+    <w:p>
+      <w:pPr>
+        <w:pStyle w:val="ListNumber"/>
+      </w:pPr>
+      <w:r>
+        <w:t>Approved LAS/CSV/core/NMR and workbook inputs are loaded only inside OSL or the approved runtime.</w:t>
+      </w:r>
+    </w:p>
+    <w:p>
+      <w:pPr>
+        <w:pStyle w:val="ListNumber"/>
+      </w:pPr>
+      <w:r>
+        <w:t>Original headers, units, sheet/source identity, and depth references are preserved before alias mapping.</w:t>
+      </w:r>
+    </w:p>
+    <w:p>
+      <w:pPr>
+        <w:pStyle w:val="ListNumber"/>
+      </w:pPr>
+      <w:r>
+        <w:t>Measured log families and approved derived physics equations build X_allowed after unit checks, QC, and depth alignment.</w:t>
+      </w:r>
+    </w:p>
+    <w:p>
+      <w:pPr>
+        <w:pStyle w:val="ListNumber"/>
+      </w:pPr>
+      <w:r>
+        <w:t>Target-only occurrence and saturation fields bypass X_allowed and are used only for target mapping, calibration, and validation overlays.</w:t>
+      </w:r>
+    </w:p>
+    <w:p>
+      <w:pPr>
+        <w:pStyle w:val="ListNumber"/>
+      </w:pPr>
+      <w:r>
+        <w:t>Validation uses complete wells, compartments, or geographic holdouts selected before preprocessing, tuning, or model fitting.</w:t>
+      </w:r>
+    </w:p>
+    <w:p>
+      <w:pPr>
+        <w:pStyle w:val="ListNumber"/>
+      </w:pPr>
+      <w:r>
+        <w:t>Reviewed outputs become occurrence probability, saturation estimate, uncertainty/QC/reason flags, plots, tables, GIS links, and public-safe summaries only after boundary review.</w:t>
       </w:r>
     </w:p>
     <w:p>
@@ -260,6 +414,54 @@
     <w:p>
       <w:r>
         <w:t>This is a workflow and admissibility-screen diagram. It does not claim final hydrate stability, hydrate proof, hydrate saturation, validated ML performance, producibility, or sweet spots.</w:t>
+      </w:r>
+    </w:p>
+    <w:p>
+      <w:pPr>
+        <w:pStyle w:val="Heading1"/>
+      </w:pPr>
+      <w:r>
+        <w:t>Mentor Decisions Needed</w:t>
+      </w:r>
+    </w:p>
+    <w:p>
+      <w:pPr>
+        <w:pStyle w:val="ListNumber"/>
+      </w:pPr>
+      <w:r>
+        <w:t>Phase-curve policy: keep methane 5 ppt as the only official baseline, or add a clearly labeled scenario table?</w:t>
+      </w:r>
+    </w:p>
+    <w:p>
+      <w:pPr>
+        <w:pStyle w:val="ListNumber"/>
+      </w:pPr>
+      <w:r>
+        <w:t>Target authority: which occurrence and saturation labels are official when Sgh, S_h, Sh, NMR_SAT, hydrate saturation, or phase labels differ?</w:t>
+      </w:r>
+    </w:p>
+    <w:p>
+      <w:pPr>
+        <w:pStyle w:val="ListNumber"/>
+      </w:pPr>
+      <w:r>
+        <w:t>Validation split: should final testing use whole-well holdout, compartment holdout, geographic holdout, or a staged combination?</w:t>
+      </w:r>
+    </w:p>
+    <w:p>
+      <w:pPr>
+        <w:pStyle w:val="ListNumber"/>
+      </w:pPr>
+      <w:r>
+        <w:t>Temperature handling: when G10015 is missing, should rows stay blocked, use nearest-control proxy tiers, or use explicit scenario-only gradients?</w:t>
+      </w:r>
+    </w:p>
+    <w:p>
+      <w:pPr>
+        <w:pStyle w:val="ListNumber"/>
+      </w:pPr>
+      <w:r>
+        <w:t>ML use of stability: is the stability screen allowed as context, confidence, reason flag, or mask only, never as an occurrence label?</w:t>
       </w:r>
     </w:p>
     <w:sectPr>

</xml_diff>

<commit_message>
Improve V5 workflow diagram readability
</commit_message>
<xml_diff>
--- a/docs/project_blueprints/North_Slope_Gas_Hydrate_Full_ML_Workflow_Diagram_2026-06-15.docx
+++ b/docs/project_blueprints/North_Slope_Gas_Hydrate_Full_ML_Workflow_Diagram_2026-06-15.docx
@@ -142,7 +142,7 @@
         <w:pStyle w:val="ListNumber"/>
       </w:pPr>
       <w:r>
-        <w:t>Measured log families and approved derived physics equations build X_allowed after unit checks, QC, and depth alignment.</w:t>
+        <w:t>Measured log families and approved derived physics equations build X allowed after unit checks, QC, and depth alignment.</w:t>
       </w:r>
     </w:p>
     <w:p>
@@ -150,7 +150,7 @@
         <w:pStyle w:val="ListNumber"/>
       </w:pPr>
       <w:r>
-        <w:t>Target-only occurrence and saturation fields bypass X_allowed and are used only for target mapping, calibration, and validation overlays.</w:t>
+        <w:t>Target-only occurrence and saturation fields bypass X allowed and are used only for target mapping, calibration, and validation overlays.</w:t>
       </w:r>
     </w:p>
     <w:p>
@@ -215,7 +215,7 @@
     </w:p>
     <w:p>
       <w:r>
-        <w:t>The companion architecture visual expands the modeling block into feature groups, QC and train-only preprocessing, a neural-network-style candidate path, two output heads, and the target-only rail used for training labels and validation overlays.</w:t>
+        <w:t>The companion architecture visual expands the modeling block into feature groups, QC, the X allowed matrix, whole-well split controls, train-only preprocessing, a simplified candidate model, two output heads, and the target-only rail used for training labels and validation overlays.</w:t>
       </w:r>
     </w:p>
     <w:p>
@@ -267,7 +267,7 @@
         <w:pStyle w:val="ListBullet"/>
       </w:pPr>
       <w:r>
-        <w:t>The left lane is source and schema control: public-source context, current status counts, original headers, unit checks, depth basis, and QC gates.</w:t>
+        <w:t>The slide-sized summary separates source/schema controls, stability context, feature engineering, leakage-safe ML, and reviewed outputs.</w:t>
       </w:r>
     </w:p>
     <w:p>
@@ -275,7 +275,7 @@
         <w:pStyle w:val="ListBullet"/>
       </w:pPr>
       <w:r>
-        <w:t>The center and right lanes are the OSL and approved-runtime path: raw source rebuilds, approved logs/core/NMR later, pressure-temperature stability context, feature engineering, modeling, and validation.</w:t>
+        <w:t>The expanded poster shows the full OSL and approved-runtime path: raw source rebuilds, approved logs/core/NMR later, pressure-temperature stability context, feature engineering, modeling, and validation.</w:t>
       </w:r>
     </w:p>
     <w:p>

</xml_diff>

<commit_message>
Complete V5 workflow diagram package
</commit_message>
<xml_diff>
--- a/docs/project_blueprints/North_Slope_Gas_Hydrate_Full_ML_Workflow_Diagram_2026-06-15.docx
+++ b/docs/project_blueprints/North_Slope_Gas_Hydrate_Full_ML_Workflow_Diagram_2026-06-15.docx
@@ -12,7 +12,7 @@
     </w:p>
     <w:p>
       <w:r>
-        <w:t>This companion page explains the one-map workflow requested for the slide refresh. The figure connects source and schema controls, OpenScienceLab and approved-runtime inputs, the guarded pressure-temperature stability branch, well-log physics equations, the leakage barrier, occurrence classification, saturation regression, validation, and reviewed exports.</w:t>
+        <w:t>This companion page explains the V5 diagram package requested for the slide refresh. The package connects source and schema controls, OpenScienceLab and approved-runtime inputs, the guarded pressure-temperature stability branch, well-log physics equations, the leakage barrier, occurrence classification, saturation regression, validation, and reviewed exports.</w:t>
       </w:r>
     </w:p>
     <w:p>
@@ -26,6 +26,43 @@
     <w:p>
       <w:r>
         <w:t>The project is building a defensible North Slope workflow for gas hydrate occurrence classification and saturation regression. The public GitHub/Streamlit side explains source-backed methods, public scaffold counts, diagrams, and public-safe outputs. OpenScienceLab and the later approved runtime are where raw source bundles, approved well logs, core/NMR information, target labels, feature engineering, model fitting, validation, and reviewed outputs belong.</w:t>
+      </w:r>
+    </w:p>
+    <w:p>
+      <w:r>
+        <w:t>The public scaffold currently has 8,084 wells, 43 GGD223 permafrost controls, 184 G10015 profiles, 3 hydrate AUs, 483 temperature-profile matches, and about 3 / 71 approved datasets visible for schema design only.</w:t>
+      </w:r>
+    </w:p>
+    <w:p>
+      <w:pPr>
+        <w:pStyle w:val="Heading1"/>
+      </w:pPr>
+      <w:r>
+        <w:t>Three Visual Levels</w:t>
+      </w:r>
+    </w:p>
+    <w:p>
+      <w:pPr>
+        <w:pStyle w:val="ListBullet"/>
+      </w:pPr>
+      <w:r>
+        <w:t>Slide 3 is the readable mentor-scale overview for a live presentation.</w:t>
+      </w:r>
+    </w:p>
+    <w:p>
+      <w:pPr>
+        <w:pStyle w:val="ListBullet"/>
+      </w:pPr>
+      <w:r>
+        <w:t>The expanded poster is the detailed architecture map with sources, equations, gates, features, targets, validation, outputs, and caveats.</w:t>
+      </w:r>
+    </w:p>
+    <w:p>
+      <w:pPr>
+        <w:pStyle w:val="ListBullet"/>
+      </w:pPr>
+      <w:r>
+        <w:t>The ML runtime detail focuses on X allowed, the Y-only label rail, split/preprocess/model controls, output heads, and validation.</w:t>
       </w:r>
     </w:p>
     <w:p>
@@ -158,6 +195,14 @@
         <w:pStyle w:val="ListNumber"/>
       </w:pPr>
       <w:r>
+        <w:t>Occurrence evidence can come from core or pressure-core observations, NMR/core-derived saturation, validated log interpretation, or regional seismic indicators, but it remains target/validation evidence.</w:t>
+      </w:r>
+    </w:p>
+    <w:p>
+      <w:pPr>
+        <w:pStyle w:val="ListNumber"/>
+      </w:pPr>
+      <w:r>
         <w:t>Validation uses complete wells, compartments, or geographic holdouts selected before preprocessing, tuning, or model fitting.</w:t>
       </w:r>
     </w:p>
@@ -167,6 +212,19 @@
       </w:pPr>
       <w:r>
         <w:t>Reviewed outputs become occurrence probability, saturation estimate, uncertainty/QC/reason flags, plots, tables, GIS links, and public-safe summaries only after boundary review.</w:t>
+      </w:r>
+    </w:p>
+    <w:p>
+      <w:pPr>
+        <w:pStyle w:val="Heading1"/>
+      </w:pPr>
+      <w:r>
+        <w:t>Slide 3 Mentor Overview</w:t>
+      </w:r>
+    </w:p>
+    <w:p>
+      <w:r>
+        <w:t>This version stays presentation-readable and leaves detailed evidence to the poster and later slides.</w:t>
       </w:r>
     </w:p>
     <w:p>
@@ -210,12 +268,12 @@
         <w:pStyle w:val="Heading1"/>
       </w:pPr>
       <w:r>
-        <w:t>ML Architecture Detail</w:t>
+        <w:t>Expanded Poster Detail</w:t>
       </w:r>
     </w:p>
     <w:p>
       <w:r>
-        <w:t>The companion architecture visual expands the modeling block into feature groups, QC, the X allowed matrix, whole-well split controls, train-only preprocessing, a simplified candidate model, two output heads, and the target-only rail used for training labels and validation overlays.</w:t>
+        <w:t>This poster is the complete architecture reference. It includes the public source counts, approved OSL inputs later, stability equations, target-only labels, leakage controls, validation expectations, public-safe outputs, and mentor decision points.</w:t>
       </w:r>
     </w:p>
     <w:p>
@@ -231,11 +289,60 @@
               <a:graphicData uri="http://schemas.openxmlformats.org/drawingml/2006/picture">
                 <pic:pic>
                   <pic:nvPicPr>
+                    <pic:cNvPr id="0" name="full_project_ml_workflow_flowchart_expanded.png"/>
+                    <pic:cNvPicPr/>
+                  </pic:nvPicPr>
+                  <pic:blipFill>
+                    <a:blip r:embed="rId10"/>
+                    <a:stretch>
+                      <a:fillRect/>
+                    </a:stretch>
+                  </pic:blipFill>
+                  <pic:spPr>
+                    <a:xfrm>
+                      <a:off x="0" y="0"/>
+                      <a:ext cx="9052560" cy="5222631"/>
+                    </a:xfrm>
+                    <a:prstGeom prst="rect"/>
+                  </pic:spPr>
+                </pic:pic>
+              </a:graphicData>
+            </a:graphic>
+          </wp:inline>
+        </w:drawing>
+      </w:r>
+    </w:p>
+    <w:p>
+      <w:pPr>
+        <w:pStyle w:val="Heading1"/>
+      </w:pPr>
+      <w:r>
+        <w:t>ML Architecture Detail</w:t>
+      </w:r>
+    </w:p>
+    <w:p>
+      <w:r>
+        <w:t>The companion architecture visual expands the modeling block into feature groups, QC, the X allowed matrix, whole-well split controls, train-only preprocessing, a simplified candidate model, two output heads, and the target-only rail used for training labels and validation overlays.</w:t>
+      </w:r>
+    </w:p>
+    <w:p>
+      <w:r>
+        <w:drawing>
+          <wp:inline xmlns:a="http://schemas.openxmlformats.org/drawingml/2006/main" xmlns:pic="http://schemas.openxmlformats.org/drawingml/2006/picture">
+            <wp:extent cx="9052560" cy="5222631"/>
+            <wp:docPr id="3" name="Picture 3"/>
+            <wp:cNvGraphicFramePr>
+              <a:graphicFrameLocks noChangeAspect="1"/>
+            </wp:cNvGraphicFramePr>
+            <a:graphic>
+              <a:graphicData uri="http://schemas.openxmlformats.org/drawingml/2006/picture">
+                <pic:pic>
+                  <pic:nvPicPr>
                     <pic:cNvPr id="0" name="ml_pipeline_network_detail_v5.png"/>
                     <pic:cNvPicPr/>
                   </pic:nvPicPr>
                   <pic:blipFill>
-                    <a:blip r:embed="rId10"/>
+                    <a:blip r:embed="rId11"/>
                     <a:stretch>
                       <a:fillRect/>
                     </a:stretch>
@@ -377,7 +484,7 @@
           </w:tcPr>
           <w:p>
             <w:r>
-              <w:t>Public/OSL boundary; phase curve; pressure model; temperature-model logic; source-control labels; guarded writer.</w:t>
+              <w:t>Public/OSL boundary; phase curve; pressure model; temperature-model logic; 8,084 public wells; 43 controls; 184 profiles; guarded writer.</w:t>
             </w:r>
           </w:p>
         </w:tc>
@@ -462,6 +569,14 @@
       </w:pPr>
       <w:r>
         <w:t>ML use of stability: is the stability screen allowed as context, confidence, reason flag, or mask only, never as an occurrence label?</w:t>
+      </w:r>
+    </w:p>
+    <w:p>
+      <w:pPr>
+        <w:pStyle w:val="ListNumber"/>
+      </w:pPr>
+      <w:r>
+        <w:t>Public website outputs: which diagrams, counts, schema, caveat views, and readiness views are acceptable before approved model validation?</w:t>
       </w:r>
     </w:p>
     <w:sectPr>

</xml_diff>